<commit_message>
rename scripts folder to code
</commit_message>
<xml_diff>
--- a/docs/Protocol_Informational_Comparisons.docx
+++ b/docs/Protocol_Informational_Comparisons.docx
@@ -2285,31 +2285,181 @@
         <w:rPr>
           <w:bCs/>
         </w:rPr>
-        <w:t>The street address entered in Step 1 is used solely for real-time geocoding (to identify the municipality) via</w:t>
-      </w:r>
-      <w:r>
-        <w:rPr>
-          <w:bCs/>
-        </w:rPr>
-        <w:t xml:space="preserve"> </w:t>
-      </w:r>
-      <w:r>
-        <w:rPr>
-          <w:bCs/>
-        </w:rPr>
-        <w:t>third-party geocoding APIs (OpenStreetMap Nominatim and Photon). The address text itself is not stored in the research</w:t>
-      </w:r>
-      <w:r>
-        <w:rPr>
-          <w:bCs/>
-        </w:rPr>
-        <w:t xml:space="preserve"> </w:t>
-      </w:r>
-      <w:r>
-        <w:rPr>
-          <w:bCs/>
-        </w:rPr>
-        <w:t>dataset. Only the identified municipality name and INEGI code are recorded.</w:t>
+        <w:t>The street address entered in Step 1 is used solely for real-time geocoding (to identify the municipality)</w:t>
+      </w:r>
+      <w:r>
+        <w:rPr>
+          <w:bCs/>
+        </w:rPr>
+        <w:t xml:space="preserve">. </w:t>
+      </w:r>
+      <w:r>
+        <w:rPr>
+          <w:bCs/>
+        </w:rPr>
+        <w:t>Geocoding is performed by two public, no-account-required</w:t>
+      </w:r>
+      <w:r>
+        <w:rPr>
+          <w:bCs/>
+        </w:rPr>
+        <w:t xml:space="preserve"> </w:t>
+      </w:r>
+      <w:r>
+        <w:rPr>
+          <w:bCs/>
+        </w:rPr>
+        <w:t>third-party APIs: Nominatim (OpenStreetMap; nominatim.openstreetmap.org) as the primary service and Photon (Komoot;</w:t>
+      </w:r>
+      <w:r>
+        <w:rPr>
+          <w:bCs/>
+        </w:rPr>
+        <w:t xml:space="preserve"> </w:t>
+      </w:r>
+      <w:r>
+        <w:rPr>
+          <w:bCs/>
+        </w:rPr>
+        <w:t>photon.komoot.io) as a fallback. No geocoding is performed locally on the server.</w:t>
+      </w:r>
+      <w:r>
+        <w:rPr>
+          <w:bCs/>
+        </w:rPr>
+        <w:t xml:space="preserve"> </w:t>
+      </w:r>
+      <w:r>
+        <w:rPr>
+          <w:bCs/>
+        </w:rPr>
+        <w:t xml:space="preserve">The address is </w:t>
+      </w:r>
+      <w:r>
+        <w:rPr>
+          <w:bCs/>
+        </w:rPr>
+        <w:t>transmitted</w:t>
+      </w:r>
+      <w:r>
+        <w:rPr>
+          <w:bCs/>
+        </w:rPr>
+        <w:t xml:space="preserve"> </w:t>
+      </w:r>
+      <w:r>
+        <w:rPr>
+          <w:bCs/>
+        </w:rPr>
+        <w:t>to these geocoding APIs</w:t>
+      </w:r>
+      <w:r>
+        <w:rPr>
+          <w:bCs/>
+        </w:rPr>
+        <w:t xml:space="preserve"> as a URL query</w:t>
+      </w:r>
+      <w:r>
+        <w:rPr>
+          <w:bCs/>
+        </w:rPr>
+        <w:t xml:space="preserve"> </w:t>
+      </w:r>
+      <w:r>
+        <w:rPr>
+          <w:bCs/>
+        </w:rPr>
+        <w:t>parameter and may therefore appear in those providers' server logs. The hosting platform (shinyapps.io) may also retain</w:t>
+      </w:r>
+      <w:r>
+        <w:rPr>
+          <w:bCs/>
+        </w:rPr>
+        <w:t xml:space="preserve"> </w:t>
+      </w:r>
+      <w:r>
+        <w:rPr>
+          <w:bCs/>
+        </w:rPr>
+        <w:t>network-level logs.</w:t>
+      </w:r>
+      <w:r>
+        <w:rPr>
+          <w:bCs/>
+        </w:rPr>
+        <w:t xml:space="preserve"> The address text itself is not stored in the research dataset</w:t>
+      </w:r>
+      <w:r>
+        <w:rPr>
+          <w:bCs/>
+        </w:rPr>
+        <w:t>, and the research</w:t>
+      </w:r>
+      <w:r>
+        <w:rPr>
+          <w:bCs/>
+        </w:rPr>
+        <w:t>er</w:t>
+      </w:r>
+      <w:r>
+        <w:rPr>
+          <w:bCs/>
+        </w:rPr>
+        <w:t xml:space="preserve"> has no mechanism to retrieve addresses from these third-part</w:t>
+      </w:r>
+      <w:r>
+        <w:rPr>
+          <w:bCs/>
+        </w:rPr>
+        <w:t>y provider logs</w:t>
+      </w:r>
+      <w:r>
+        <w:rPr>
+          <w:bCs/>
+        </w:rPr>
+        <w:t xml:space="preserve">. </w:t>
+      </w:r>
+      <w:r>
+        <w:rPr>
+          <w:bCs/>
+        </w:rPr>
+        <w:t xml:space="preserve">The address text entered by the respondent is </w:t>
+      </w:r>
+      <w:r>
+        <w:rPr>
+          <w:bCs/>
+        </w:rPr>
+        <w:t>NOT</w:t>
+      </w:r>
+      <w:r>
+        <w:rPr>
+          <w:bCs/>
+        </w:rPr>
+        <w:t xml:space="preserve"> stored in any</w:t>
+      </w:r>
+      <w:r>
+        <w:rPr>
+          <w:bCs/>
+        </w:rPr>
+        <w:t xml:space="preserve"> </w:t>
+      </w:r>
+      <w:r>
+        <w:rPr>
+          <w:bCs/>
+        </w:rPr>
+        <w:t>researcher-controlled data file.</w:t>
+      </w:r>
+      <w:r>
+        <w:rPr>
+          <w:bCs/>
+        </w:rPr>
+        <w:t xml:space="preserve"> </w:t>
+      </w:r>
+      <w:r>
+        <w:rPr>
+          <w:bCs/>
+        </w:rPr>
+        <w:t>Only the derived municipality name and INEGI code are retained in the study data.</w:t>
       </w:r>
     </w:p>
     <w:p>
@@ -2555,7 +2705,14 @@
         <w:rPr>
           <w:bCs/>
         </w:rPr>
-        <w:t>preferences, and demographic information. It does not involve medical testing, biological samples, psychological or</w:t>
+        <w:t xml:space="preserve">preferences, and demographic information. It does not involve </w:t>
+      </w:r>
+      <w:r>
+        <w:rPr>
+          <w:bCs/>
+        </w:rPr>
+        <w:lastRenderedPageBreak/>
+        <w:t>medical testing, biological samples, psychological or</w:t>
       </w:r>
       <w:r>
         <w:rPr>
@@ -2676,7 +2833,6 @@
         <w:rPr>
           <w:color w:val="auto"/>
         </w:rPr>
-        <w:lastRenderedPageBreak/>
         <w:t>As the study is an anonymous survey, I do not anticipate any risks from data storage or leaks.</w:t>
       </w:r>
     </w:p>
@@ -3201,17 +3357,16 @@
           <w:bCs/>
           <w:color w:val="222A35"/>
         </w:rPr>
-        <w:t>second wave will not be followed further, and only first-wave data will be used for those respondents.</w:t>
-      </w:r>
-    </w:p>
-    <w:p>
-      <w:pPr>
-        <w:pStyle w:val="Default"/>
+        <w:t xml:space="preserve">second wave will not be followed </w:t>
+      </w:r>
+      <w:r>
         <w:rPr>
           <w:bCs/>
           <w:color w:val="222A35"/>
         </w:rPr>
-      </w:pPr>
+        <w:lastRenderedPageBreak/>
+        <w:t>further, and only first-wave data will be used for those respondents.</w:t>
+      </w:r>
     </w:p>
     <w:p>
       <w:pPr>
@@ -3221,11 +3376,20 @@
           <w:color w:val="222A35"/>
         </w:rPr>
       </w:pPr>
-      <w:r>
+    </w:p>
+    <w:p>
+      <w:pPr>
+        <w:pStyle w:val="Default"/>
         <w:rPr>
           <w:bCs/>
           <w:color w:val="222A35"/>
         </w:rPr>
+      </w:pPr>
+      <w:r>
+        <w:rPr>
+          <w:bCs/>
+          <w:color w:val="222A35"/>
+        </w:rPr>
         <w:t>Use of data after withdrawal: Data from participants who fail attention checks and are withdrawn by the investigator</w:t>
       </w:r>
       <w:r>
@@ -3289,15 +3453,7 @@
           <w:bCs/>
           <w:color w:val="222A35"/>
         </w:rPr>
-        <w:t xml:space="preserve"> Responses from respondents who complete the first wave survey but do not complete the second wave survey will be used for the descriptive </w:t>
-      </w:r>
-      <w:r>
-        <w:rPr>
-          <w:bCs/>
-          <w:color w:val="222A35"/>
-        </w:rPr>
-        <w:lastRenderedPageBreak/>
-        <w:t>analysis in the research design.</w:t>
+        <w:t xml:space="preserve"> Responses from respondents who complete the first wave survey but do not complete the second wave survey will be used for the descriptive analysis in the research design.</w:t>
       </w:r>
     </w:p>
     <w:p>
@@ -4541,6 +4697,7 @@
           <w:bCs/>
           <w:color w:val="171717"/>
         </w:rPr>
+        <w:lastRenderedPageBreak/>
         <w:t xml:space="preserve">DATA AND </w:t>
       </w:r>
       <w:r>
@@ -4679,14 +4836,7 @@
         <w:rPr>
           <w:color w:val="auto"/>
         </w:rPr>
-        <w:t xml:space="preserve">The data analysis plan is described in detail in the research proposal and research pre-analysis </w:t>
-      </w:r>
-      <w:r>
-        <w:rPr>
-          <w:color w:val="auto"/>
-        </w:rPr>
-        <w:lastRenderedPageBreak/>
-        <w:t>plan.</w:t>
+        <w:t>The data analysis plan is described in detail in the research proposal and research pre-analysis plan.</w:t>
       </w:r>
     </w:p>
     <w:p>
@@ -5049,6 +5199,7 @@
         <w:rPr>
           <w:bCs/>
         </w:rPr>
+        <w:lastRenderedPageBreak/>
         <w:t xml:space="preserve">  20(1), 1–27.</w:t>
       </w:r>
     </w:p>
@@ -5107,14 +5258,7 @@
         <w:rPr>
           <w:bCs/>
         </w:rPr>
-        <w:t xml:space="preserve">  Sabet, D. M. (2012). Police Reform in Mexico: Informal Politics and the Challenge of </w:t>
-      </w:r>
-      <w:r>
-        <w:rPr>
-          <w:bCs/>
-        </w:rPr>
-        <w:lastRenderedPageBreak/>
-        <w:t>Institutional Change. Stanford</w:t>
+        <w:t xml:space="preserve">  Sabet, D. M. (2012). Police Reform in Mexico: Informal Politics and the Challenge of Institutional Change. Stanford</w:t>
       </w:r>
     </w:p>
     <w:p>

</xml_diff>